<commit_message>
update sources and links
</commit_message>
<xml_diff>
--- a/Data_Sources_and_Links/Data_Sources_and_Links.docx
+++ b/Data_Sources_and_Links/Data_Sources_and_Links.docx
@@ -50,7 +50,7 @@
       <w:r>
         <w:t xml:space="preserve"> </w:t>
       </w:r>
-      <w:hyperlink r:id="rId7" w:history="1">
+      <w:hyperlink r:id="rId7" w:anchor="signup" w:history="1">
         <w:r>
           <w:rPr>
             <w:rStyle w:val="Hyperlink"/>
@@ -172,19 +172,7 @@
           <w:rPr>
             <w:rStyle w:val="Hyperlink"/>
           </w:rPr>
-          <w:t>https://apps.bea.gov/API/signup/?_gl=1*r6v072*_ga*ODA2NDgzNDI1LjE3MzgwMzk1Njc.*_ga_J4698JNNFT*MTczODAzOTU2Ni4xLjEuMTczODAzO</w:t>
-        </w:r>
-        <w:r>
-          <w:rPr>
-            <w:rStyle w:val="Hyperlink"/>
-          </w:rPr>
-          <w:t>T</w:t>
-        </w:r>
-        <w:r>
-          <w:rPr>
-            <w:rStyle w:val="Hyperlink"/>
-          </w:rPr>
-          <w:t>YzMi41OS4wLjA</w:t>
+          <w:t>https://apps.bea.gov/API/signup/?_gl=1*r6v072*_ga*ODA2NDgzNDI1LjE3MzgwMzk1Njc.*_ga_J4698JNNFT*MTczODAzOTU2Ni4xLjEuMTczODAzOTYzMi41OS4wLjA</w:t>
         </w:r>
       </w:hyperlink>
     </w:p>
@@ -322,7 +310,7 @@
         </w:rPr>
         <w:t xml:space="preserve">Commission </w:t>
       </w:r>
-      <w:hyperlink r:id="rId16" w:history="1">
+      <w:hyperlink r:id="rId16" w:anchor="block-symsoft-page-title" w:history="1">
         <w:r>
           <w:rPr>
             <w:rStyle w:val="Hyperlink"/>
@@ -366,7 +354,7 @@
       <w:r>
         <w:t xml:space="preserve"> </w:t>
       </w:r>
-      <w:hyperlink r:id="rId18" w:history="1">
+      <w:hyperlink r:id="rId18" w:anchor="block-symsoft-page-title" w:history="1">
         <w:r>
           <w:rPr>
             <w:rStyle w:val="Hyperlink"/>
@@ -444,6 +432,17 @@
     </w:pPr>
     <w:r>
       <w:t>Lucko, Dylan</w:t>
+    </w:r>
+  </w:p>
+  <w:p>
+    <w:pPr>
+      <w:pStyle w:val="Header"/>
+    </w:pPr>
+    <w:r>
+      <w:t>Greener Roads, Cleaner Air? Evaluating the Effect of EV Subsidies on Air Quality</w:t>
+    </w:r>
+    <w:r>
+      <w:t xml:space="preserve"> Evidence from California</w:t>
     </w:r>
   </w:p>
   <w:p>

</xml_diff>